<commit_message>
Regenerate Johanna Castillo deliverables with corrected leg direction
Left leg now correctly leads all unilateral leg work throughout (Day 2
title, exercise flags, baseline notes, milestones) — consistent with
the auto-generated Styku block and confirmed clean by the new
pre-export validator (0 issues, down from 7 contradictions).

Co-Authored-By: Claude Sonnet 5 <noreply@anthropic.com>
Claude-Session: https://claude.ai/code/session_0143fcLkS7e1LgrMwD9HyxLY
</commit_message>
<xml_diff>
--- a/deliverables/johanna-castillo/johanna-castillo.docx
+++ b/deliverables/johanna-castillo/johanna-castillo.docx
@@ -337,7 +337,7 @@
                 <w:sz w:val="16"/>
                 <w:szCs w:val="16"/>
               </w:rPr>
-              <w:t xml:space="preserve">Squat &amp; Deadlift Introduction + Right-Leg Asymmetry Protocol</w:t>
+              <w:t xml:space="preserve">Squat &amp; Deadlift Introduction + Left-Leg Asymmetry Protocol</w:t>
             </w:r>
           </w:p>
         </w:tc>
@@ -1628,7 +1628,7 @@
                 <w:sz w:val="17"/>
                 <w:szCs w:val="17"/>
               </w:rPr>
-              <w:t xml:space="preserve">Right Leg Asymmetry — 0.5 lb L/R Gap</w:t>
+              <w:t xml:space="preserve">Left Leg Asymmetry — 0.5 lb L/R Gap</w:t>
             </w:r>
           </w:p>
           <w:p>
@@ -1639,7 +1639,7 @@
                 <w:sz w:val="17"/>
                 <w:szCs w:val="17"/>
               </w:rPr>
-              <w:t xml:space="preserve">Styku segmental LST: left leg 17.5 lbs vs right leg 18.0 lbs — gap sits exactly at the 0.5 lb asymmetry protocol trigger. Right leg leads all unilateral lower-body work; track gap at 8-week rescan.</w:t>
+              <w:t xml:space="preserve">Styku segmental LST: left leg 17.5 lbs vs right leg 18.0 lbs — gap sits exactly at the 0.5 lb asymmetry protocol trigger. Left leg has the lower LST value and leads all unilateral lower-body work; track gap at 8-week rescan.</w:t>
             </w:r>
           </w:p>
         </w:tc>
@@ -5836,7 +5836,7 @@
                 <w:sz w:val="15"/>
                 <w:szCs w:val="15"/>
               </w:rPr>
-              <w:t xml:space="preserve">Squat &amp; Deadlift Introduction + Right-Leg Asymmetry Protocol</w:t>
+              <w:t xml:space="preserve">Squat &amp; Deadlift Introduction + Left-Leg Asymmetry Protocol</w:t>
             </w:r>
           </w:p>
           <w:p>
@@ -5870,7 +5870,7 @@
           <w:sz w:val="15"/>
           <w:szCs w:val="15"/>
         </w:rPr>
-        <w:t xml:space="preserve">60% day — technique priority. Squat and deadlift were not tested in the initial battery, so today's loads are deliberately light and become the new 8-week baseline. Right leg leads every unilateral set — Styku segmental LST shows an 0.5 lb deficit (17.5 vs 18.0 lbs), exactly at the asymmetry protocol trigger.</w:t>
+        <w:t xml:space="preserve">60% day — technique priority. Squat and deadlift were not tested in the initial battery, so today's loads are deliberately light and become the new 8-week baseline. Left leg leads every unilateral set — Styku segmental LST shows a 0.5 lb deficit (17.5 vs 18.0 lbs), exactly at the asymmetry protocol trigger.</w:t>
       </w:r>
     </w:p>
     <w:tbl>
@@ -7107,7 +7107,7 @@
           <w:sz w:val="17"/>
           <w:szCs w:val="17"/>
         </w:rPr>
-        <w:t xml:space="preserve">C  —  UNILATERAL LEG — RIGHT-LED</w:t>
+        <w:t xml:space="preserve">C  —  UNILATERAL LEG — LEFT-LED</w:t>
       </w:r>
     </w:p>
     <w:p>
@@ -7121,7 +7121,7 @@
           <w:sz w:val="15"/>
           <w:szCs w:val="15"/>
         </w:rPr>
-        <w:t xml:space="preserve">Styku scan shows a 0.5 lb right-leg deficit (L 17.5 / R 18.0) — at the asymmetry trigger threshold. Right leg leads every set below; log reps per side.</w:t>
+        <w:t xml:space="preserve">Styku scan shows a 0.5 lb left-leg deficit (L 17.5 / R 18.0) — at the asymmetry trigger threshold. Left leg leads every set below; log reps per side.</w:t>
       </w:r>
     </w:p>
     <w:tbl>
@@ -7360,7 +7360,7 @@
                 <w:sz w:val="12"/>
                 <w:szCs w:val="12"/>
               </w:rPr>
-              <w:t xml:space="preserve">Right leg weaker (Styku) — leads every set</w:t>
+              <w:t xml:space="preserve">Left leg weaker (Styku) — leads every set</w:t>
             </w:r>
           </w:p>
         </w:tc>
@@ -7498,7 +7498,7 @@
                 <w:sz w:val="13"/>
                 <w:szCs w:val="13"/>
               </w:rPr>
-              <w:t xml:space="preserve">Right leg first. Hinge, flat back, soft knee.</w:t>
+              <w:t xml:space="preserve">Left leg first. Hinge, flat back, soft knee.</w:t>
             </w:r>
             <w:r>
               <w:rPr>
@@ -7549,7 +7549,7 @@
                 <w:sz w:val="12"/>
                 <w:szCs w:val="12"/>
               </w:rPr>
-              <w:t xml:space="preserve">Right leg leads</w:t>
+              <w:t xml:space="preserve">Left leg leads</w:t>
             </w:r>
           </w:p>
         </w:tc>
@@ -7687,7 +7687,7 @@
                 <w:sz w:val="13"/>
                 <w:szCs w:val="13"/>
               </w:rPr>
-              <w:t xml:space="preserve">Right leg first. Knee tracks over mid-foot.</w:t>
+              <w:t xml:space="preserve">Left leg first. Knee tracks over mid-foot.</w:t>
             </w:r>
             <w:r>
               <w:rPr>
@@ -8452,7 +8452,7 @@
                 <w:sz w:val="17"/>
                 <w:szCs w:val="17"/>
               </w:rPr>
-              <w:t xml:space="preserve">First exposure to squat and deadlift patterns — log today's working loads as the new baseline for 8-week testing. Right leg leads all unilateral work this block; track the L/R gap at rescan.</w:t>
+              <w:t xml:space="preserve">First exposure to squat and deadlift patterns — log today's working loads as the new baseline for 8-week testing. Left leg leads all unilateral work this block; track the L/R gap at rescan.</w:t>
             </w:r>
           </w:p>
         </w:tc>
@@ -11916,7 +11916,7 @@
                 <w:sz w:val="17"/>
                 <w:szCs w:val="17"/>
               </w:rPr>
-              <w:t xml:space="preserve">Clean, repeatable squat and deadlift patterns at technique loads; right leg leads all unilateral leg work without compensation; conditioning finishers completed at brisk, sustainable effort each session.</w:t>
+              <w:t xml:space="preserve">Clean, repeatable squat and deadlift patterns at technique loads; left leg leads all unilateral leg work without compensation; conditioning finishers completed at brisk, sustainable effort each session.</w:t>
             </w:r>
           </w:p>
         </w:tc>
@@ -11978,7 +11978,7 @@
                 <w:sz w:val="17"/>
                 <w:szCs w:val="17"/>
               </w:rPr>
-              <w:t xml:space="preserve">Full Styku rescan. VFA should trend down from 142.7 cm² toward the moderate-risk band; body fat % and Shape Score should improve; right-leg L/R gap should narrow below the 0.5 lb trigger; squat, deadlift, and lunge baselines formally established with 8-week targets set.</w:t>
+              <w:t xml:space="preserve">Full Styku rescan. VFA should trend down from 142.7 cm² toward the moderate-risk band; body fat % and Shape Score should improve; left-leg L/R gap should narrow below the 0.5 lb trigger; squat, deadlift, and lunge baselines formally established with 8-week targets set.</w:t>
             </w:r>
           </w:p>
         </w:tc>
@@ -12040,7 +12040,7 @@
                 <w:sz w:val="17"/>
                 <w:szCs w:val="17"/>
               </w:rPr>
-              <w:t xml:space="preserve">Schedule Styku rescan at week 8 to confirm VFA and body fat trend, right-leg asymmetry reduction, and to formally baseline squat, deadlift, and lunges for future progression targets.</w:t>
+              <w:t xml:space="preserve">Schedule Styku rescan at week 8 to confirm VFA and body fat trend, left-leg asymmetry reduction, and to formally baseline squat, deadlift, and lunges for future progression targets.</w:t>
             </w:r>
           </w:p>
         </w:tc>

</xml_diff>

<commit_message>
Fix validator false positive; regenerate Johanna Castillo from scratch
validate.mjs's asymmetry check required only "<side> ... leads" nearby,
so a leg-check regex could match an unrelated arm sentence ("right arm
is marginally weaker and leads..."). Scoped the match to require the
body-part word (leg/arm) adjacent to the side, so cross-part false
positives aren't possible.

Also reran the full pipeline for Johanna Castillo from a clean state
(fresh agent call, fresh render) per request — confirmed the new
data.json is independently consistent (left leg leads, ALST correctly
marked optimal, VFA cardiometabolic flag) and passes validation.

Co-Authored-By: Claude Sonnet 5 <noreply@anthropic.com>
Claude-Session: https://claude.ai/code/session_0143fcLkS7e1LgrMwD9HyxLY
</commit_message>
<xml_diff>
--- a/deliverables/johanna-castillo/johanna-castillo.docx
+++ b/deliverables/johanna-castillo/johanna-castillo.docx
@@ -621,7 +621,7 @@
                 <w:sz w:val="16"/>
                 <w:szCs w:val="16"/>
               </w:rPr>
-              <w:t xml:space="preserve">2026-08-07</w:t>
+              <w:t xml:space="preserve">—</w:t>
             </w:r>
           </w:p>
         </w:tc>
@@ -711,7 +711,7 @@
                 <w:sz w:val="16"/>
                 <w:szCs w:val="16"/>
               </w:rPr>
-              <w:t xml:space="preserve">2026-08-07</w:t>
+              <w:t xml:space="preserve">—</w:t>
             </w:r>
           </w:p>
         </w:tc>
@@ -823,7 +823,7 @@
                 <w:sz w:val="16"/>
                 <w:szCs w:val="16"/>
               </w:rPr>
-              <w:t xml:space="preserve">20 lbs x 5</w:t>
+              <w:t xml:space="preserve">20 lbs x 5, 2 RIR</w:t>
             </w:r>
           </w:p>
         </w:tc>
@@ -847,7 +847,7 @@
                 <w:sz w:val="16"/>
                 <w:szCs w:val="16"/>
               </w:rPr>
-              <w:t xml:space="preserve">Incline Push-Up</w:t>
+              <w:t xml:space="preserve">Incline Dumbbell Press</w:t>
             </w:r>
           </w:p>
         </w:tc>
@@ -869,7 +869,7 @@
                 <w:sz w:val="16"/>
                 <w:szCs w:val="16"/>
               </w:rPr>
-              <w:t xml:space="preserve">6 reps (bodyweight)</w:t>
+              <w:t xml:space="preserve">Not tested</w:t>
             </w:r>
           </w:p>
         </w:tc>
@@ -891,7 +891,7 @@
                 <w:sz w:val="16"/>
                 <w:szCs w:val="16"/>
               </w:rPr>
-              <w:t xml:space="preserve">2026-08-07</w:t>
+              <w:t xml:space="preserve">—</w:t>
             </w:r>
           </w:p>
         </w:tc>
@@ -913,7 +913,7 @@
                 <w:sz w:val="16"/>
                 <w:szCs w:val="16"/>
               </w:rPr>
-              <w:t xml:space="preserve">10-12 reps</w:t>
+              <w:t xml:space="preserve">Establish baseline within 2 weeks</w:t>
             </w:r>
           </w:p>
         </w:tc>
@@ -937,7 +937,7 @@
                 <w:sz w:val="16"/>
                 <w:szCs w:val="16"/>
               </w:rPr>
-              <w:t xml:space="preserve">Dumbbell Farmers Carry</w:t>
+              <w:t xml:space="preserve">Push-Ups (Incline)</w:t>
             </w:r>
           </w:p>
         </w:tc>
@@ -959,7 +959,7 @@
                 <w:sz w:val="16"/>
                 <w:szCs w:val="16"/>
               </w:rPr>
-              <w:t xml:space="preserve">30 lbs/hand</w:t>
+              <w:t xml:space="preserve">6 reps (bodyweight)</w:t>
             </w:r>
           </w:p>
         </w:tc>
@@ -1003,7 +1003,7 @@
                 <w:sz w:val="16"/>
                 <w:szCs w:val="16"/>
               </w:rPr>
-              <w:t xml:space="preserve">40 lbs/hand</w:t>
+              <w:t xml:space="preserve">10-12 reps</w:t>
             </w:r>
           </w:p>
         </w:tc>
@@ -1027,7 +1027,7 @@
                 <w:sz w:val="16"/>
                 <w:szCs w:val="16"/>
               </w:rPr>
-              <w:t xml:space="preserve">Hip Thrust</w:t>
+              <w:t xml:space="preserve">Dumbbell Farmers Carry</w:t>
             </w:r>
           </w:p>
         </w:tc>
@@ -1049,7 +1049,7 @@
                 <w:sz w:val="16"/>
                 <w:szCs w:val="16"/>
               </w:rPr>
-              <w:t xml:space="preserve">55 lbs x 5</w:t>
+              <w:t xml:space="preserve">30 lbs/hand</w:t>
             </w:r>
           </w:p>
         </w:tc>
@@ -1093,7 +1093,7 @@
                 <w:sz w:val="16"/>
                 <w:szCs w:val="16"/>
               </w:rPr>
-              <w:t xml:space="preserve">75 lbs x 5</w:t>
+              <w:t xml:space="preserve">40 lbs/hand x 40 yd</w:t>
             </w:r>
           </w:p>
         </w:tc>
@@ -1117,7 +1117,7 @@
                 <w:sz w:val="16"/>
                 <w:szCs w:val="16"/>
               </w:rPr>
-              <w:t xml:space="preserve">Single-Leg RDL</w:t>
+              <w:t xml:space="preserve">Hip Thrust</w:t>
             </w:r>
           </w:p>
         </w:tc>
@@ -1139,7 +1139,7 @@
                 <w:sz w:val="16"/>
                 <w:szCs w:val="16"/>
               </w:rPr>
-              <w:t xml:space="preserve">20 lbs/hand x 5</w:t>
+              <w:t xml:space="preserve">55 lbs x 5</w:t>
             </w:r>
           </w:p>
         </w:tc>
@@ -1183,7 +1183,7 @@
                 <w:sz w:val="16"/>
                 <w:szCs w:val="16"/>
               </w:rPr>
-              <w:t xml:space="preserve">25 lbs/hand x 5</w:t>
+              <w:t xml:space="preserve">75 lbs x 5, 1-2 RIR</w:t>
             </w:r>
           </w:p>
         </w:tc>
@@ -1207,7 +1207,7 @@
                 <w:sz w:val="16"/>
                 <w:szCs w:val="16"/>
               </w:rPr>
-              <w:t xml:space="preserve">Lunges</w:t>
+              <w:t xml:space="preserve">Single-Leg RDL</w:t>
             </w:r>
           </w:p>
         </w:tc>
@@ -1229,7 +1229,7 @@
                 <w:sz w:val="16"/>
                 <w:szCs w:val="16"/>
               </w:rPr>
-              <w:t xml:space="preserve">Not tested</w:t>
+              <w:t xml:space="preserve">20 lbs/hand x 5</w:t>
             </w:r>
           </w:p>
         </w:tc>
@@ -1273,7 +1273,7 @@
                 <w:sz w:val="16"/>
                 <w:szCs w:val="16"/>
               </w:rPr>
-              <w:t xml:space="preserve">Establish baseline within 2 weeks</w:t>
+              <w:t xml:space="preserve">25 lbs/hand x 6-8</w:t>
             </w:r>
           </w:p>
         </w:tc>
@@ -1297,7 +1297,7 @@
                 <w:sz w:val="16"/>
                 <w:szCs w:val="16"/>
               </w:rPr>
-              <w:t xml:space="preserve">Plank Hold</w:t>
+              <w:t xml:space="preserve">Lunges</w:t>
             </w:r>
           </w:p>
         </w:tc>
@@ -1319,7 +1319,7 @@
                 <w:sz w:val="16"/>
                 <w:szCs w:val="16"/>
               </w:rPr>
-              <w:t xml:space="preserve">37 sec</w:t>
+              <w:t xml:space="preserve">Not tested</w:t>
             </w:r>
           </w:p>
         </w:tc>
@@ -1341,7 +1341,7 @@
                 <w:sz w:val="16"/>
                 <w:szCs w:val="16"/>
               </w:rPr>
-              <w:t xml:space="preserve">2026-08-07</w:t>
+              <w:t xml:space="preserve">—</w:t>
             </w:r>
           </w:p>
         </w:tc>
@@ -1363,7 +1363,7 @@
                 <w:sz w:val="16"/>
                 <w:szCs w:val="16"/>
               </w:rPr>
-              <w:t xml:space="preserve">60 sec</w:t>
+              <w:t xml:space="preserve">Establish baseline within 2 weeks</w:t>
             </w:r>
           </w:p>
         </w:tc>
@@ -1387,7 +1387,7 @@
                 <w:sz w:val="16"/>
                 <w:szCs w:val="16"/>
               </w:rPr>
-              <w:t xml:space="preserve">Pull-Ups</w:t>
+              <w:t xml:space="preserve">Plank Hold</w:t>
             </w:r>
           </w:p>
         </w:tc>
@@ -1409,7 +1409,7 @@
                 <w:sz w:val="16"/>
                 <w:szCs w:val="16"/>
               </w:rPr>
-              <w:t xml:space="preserve">Not tested</w:t>
+              <w:t xml:space="preserve">37 sec</w:t>
             </w:r>
           </w:p>
         </w:tc>
@@ -1453,7 +1453,97 @@
                 <w:sz w:val="16"/>
                 <w:szCs w:val="16"/>
               </w:rPr>
-              <w:t xml:space="preserve">Assess Week 4</w:t>
+              <w:t xml:space="preserve">60+ sec</w:t>
+            </w:r>
+          </w:p>
+        </w:tc>
+      </w:tr>
+      <w:tr>
+        <w:tc>
+          <w:tcPr>
+            <w:tcW w:type="dxa" w:w="2600"/>
+            <w:tcMar>
+              <w:top w:type="dxa" w:w="70"/>
+              <w:left w:type="dxa" w:w="120"/>
+              <w:bottom w:type="dxa" w:w="70"/>
+              <w:right w:type="dxa" w:w="120"/>
+            </w:tcMar>
+          </w:tcPr>
+          <w:p>
+            <w:r>
+              <w:rPr>
+                <w:rFonts w:ascii="Arial" w:cs="Arial" w:eastAsia="Arial" w:hAnsi="Arial"/>
+                <w:color w:val="2C2C2C"/>
+                <w:sz w:val="16"/>
+                <w:szCs w:val="16"/>
+              </w:rPr>
+              <w:t xml:space="preserve">Pull-Ups</w:t>
+            </w:r>
+          </w:p>
+        </w:tc>
+        <w:tc>
+          <w:tcPr>
+            <w:tcW w:type="dxa" w:w="1600"/>
+            <w:tcMar>
+              <w:top w:type="dxa" w:w="70"/>
+              <w:left w:type="dxa" w:w="120"/>
+              <w:bottom w:type="dxa" w:w="70"/>
+              <w:right w:type="dxa" w:w="120"/>
+            </w:tcMar>
+          </w:tcPr>
+          <w:p>
+            <w:r>
+              <w:rPr>
+                <w:rFonts w:ascii="Arial" w:cs="Arial" w:eastAsia="Arial" w:hAnsi="Arial"/>
+                <w:color w:val="2C2C2C"/>
+                <w:sz w:val="16"/>
+                <w:szCs w:val="16"/>
+              </w:rPr>
+              <w:t xml:space="preserve">Not tested</w:t>
+            </w:r>
+          </w:p>
+        </w:tc>
+        <w:tc>
+          <w:tcPr>
+            <w:tcW w:type="dxa" w:w="1400"/>
+            <w:tcMar>
+              <w:top w:type="dxa" w:w="70"/>
+              <w:left w:type="dxa" w:w="120"/>
+              <w:bottom w:type="dxa" w:w="70"/>
+              <w:right w:type="dxa" w:w="120"/>
+            </w:tcMar>
+          </w:tcPr>
+          <w:p>
+            <w:r>
+              <w:rPr>
+                <w:rFonts w:ascii="Arial" w:cs="Arial" w:eastAsia="Arial" w:hAnsi="Arial"/>
+                <w:color w:val="2C2C2C"/>
+                <w:sz w:val="16"/>
+                <w:szCs w:val="16"/>
+              </w:rPr>
+              <w:t xml:space="preserve">—</w:t>
+            </w:r>
+          </w:p>
+        </w:tc>
+        <w:tc>
+          <w:tcPr>
+            <w:tcW w:type="dxa" w:w="4840"/>
+            <w:tcMar>
+              <w:top w:type="dxa" w:w="70"/>
+              <w:left w:type="dxa" w:w="120"/>
+              <w:bottom w:type="dxa" w:w="70"/>
+              <w:right w:type="dxa" w:w="120"/>
+            </w:tcMar>
+          </w:tcPr>
+          <w:p>
+            <w:r>
+              <w:rPr>
+                <w:rFonts w:ascii="Arial" w:cs="Arial" w:eastAsia="Arial" w:hAnsi="Arial"/>
+                <w:color w:val="2C2C2C"/>
+                <w:sz w:val="16"/>
+                <w:szCs w:val="16"/>
+              </w:rPr>
+              <w:t xml:space="preserve">Assess assisted pathway Week 4</w:t>
             </w:r>
           </w:p>
         </w:tc>
@@ -1468,12 +1558,12 @@
       <w:tblPr>
         <w:tblW w:type="dxa" w:w="10440"/>
         <w:tblBorders>
-          <w:top w:val="single" w:color="43A047" w:sz="8"/>
-          <w:left w:val="single" w:color="43A047" w:sz="8"/>
-          <w:bottom w:val="single" w:color="43A047" w:sz="8"/>
-          <w:right w:val="single" w:color="43A047" w:sz="8"/>
-          <w:insideH w:val="single" w:color="43A047" w:sz="8"/>
-          <w:insideV w:val="single" w:color="43A047" w:sz="8"/>
+          <w:top w:val="single" w:color="E65100" w:sz="20"/>
+          <w:left w:val="single" w:color="E65100" w:sz="20"/>
+          <w:bottom w:val="single" w:color="E65100" w:sz="20"/>
+          <w:right w:val="single" w:color="E65100" w:sz="20"/>
+          <w:insideH w:val="single" w:color="E65100" w:sz="20"/>
+          <w:insideV w:val="single" w:color="E65100" w:sz="20"/>
         </w:tblBorders>
       </w:tblPr>
       <w:tblGrid>
@@ -1483,7 +1573,7 @@
         <w:tc>
           <w:tcPr>
             <w:tcW w:type="dxa" w:w="10440"/>
-            <w:shd w:fill="E8F5E9" w:color="auto" w:val="clear"/>
+            <w:shd w:fill="FAF3E0" w:color="auto" w:val="clear"/>
             <w:tcMar>
               <w:top w:type="dxa" w:w="100"/>
               <w:left w:type="dxa" w:w="160"/>
@@ -1500,11 +1590,11 @@
                 <w:rFonts w:ascii="Arial" w:cs="Arial" w:eastAsia="Arial" w:hAnsi="Arial"/>
                 <w:b/>
                 <w:bCs/>
-                <w:color w:val="43A047"/>
+                <w:color w:val="E65100"/>
                 <w:sz w:val="17"/>
                 <w:szCs w:val="17"/>
               </w:rPr>
-              <w:t xml:space="preserve">ALST Optimal — 7.23 kg/m²</w:t>
+              <w:t xml:space="preserve">Visceral Fat Area — 142.7 cm², Cardiometabolic Priority</w:t>
             </w:r>
           </w:p>
           <w:p>
@@ -1515,7 +1605,7 @@
                 <w:sz w:val="17"/>
                 <w:szCs w:val="17"/>
               </w:rPr>
-              <w:t xml:space="preserve">Appendicular Lean Soft Tissue Index of 7.23 kg/m² is at/above the 7.0 EWGSOP2 optimal threshold — not At-Risk. This is not a sarcopenia profile; programming is strength-maintenance, not muscle-building-primary. Protein is still escalated to 2.0-2.2 g/kg/day (156-172g/day), driven by the 50+ age rule independent of the ALST result.</w:t>
+              <w:t xml:space="preserve">VFA sits well above the 100 cm² cardiometabolic risk threshold — the primary clinical priority for this block. Programming layers metabolic conditioning finishers on top of strength maintenance rather than a muscle-building-primary framing.</w:t>
             </w:r>
           </w:p>
         </w:tc>
@@ -1566,7 +1656,7 @@
                 <w:sz w:val="17"/>
                 <w:szCs w:val="17"/>
               </w:rPr>
-              <w:t xml:space="preserve">Visceral Fat Area — 142.7 cm², Moderate-High Risk</w:t>
+              <w:t xml:space="preserve">Left Leg Asymmetry — 0.5 lb L/R Gap</w:t>
             </w:r>
           </w:p>
           <w:p>
@@ -1577,7 +1667,7 @@
                 <w:sz w:val="17"/>
                 <w:szCs w:val="17"/>
               </w:rPr>
-              <w:t xml:space="preserve">VFA sits well above the 100 cm² moderate-risk threshold — the primary cardiometabolic priority for this block. Programming layers metabolic conditioning finishers on top of strength maintenance rather than a muscle-building-primary framing.</w:t>
+              <w:t xml:space="preserve">Styku segmental LST: left leg 17.5 lbs vs right leg 18.0 lbs — gap sits exactly at the 0.5 lb asymmetry protocol trigger. Left leg has the lower LST value and leads all unilateral lower-body work; track gap at 8-week rescan.</w:t>
             </w:r>
           </w:p>
         </w:tc>
@@ -1592,12 +1682,12 @@
       <w:tblPr>
         <w:tblW w:type="dxa" w:w="10440"/>
         <w:tblBorders>
-          <w:top w:val="single" w:color="E65100" w:sz="20"/>
-          <w:left w:val="single" w:color="E65100" w:sz="20"/>
-          <w:bottom w:val="single" w:color="E65100" w:sz="20"/>
-          <w:right w:val="single" w:color="E65100" w:sz="20"/>
-          <w:insideH w:val="single" w:color="E65100" w:sz="20"/>
-          <w:insideV w:val="single" w:color="E65100" w:sz="20"/>
+          <w:top w:val="single" w:color="43A047" w:sz="8"/>
+          <w:left w:val="single" w:color="43A047" w:sz="8"/>
+          <w:bottom w:val="single" w:color="43A047" w:sz="8"/>
+          <w:right w:val="single" w:color="43A047" w:sz="8"/>
+          <w:insideH w:val="single" w:color="43A047" w:sz="8"/>
+          <w:insideV w:val="single" w:color="43A047" w:sz="8"/>
         </w:tblBorders>
       </w:tblPr>
       <w:tblGrid>
@@ -1607,7 +1697,7 @@
         <w:tc>
           <w:tcPr>
             <w:tcW w:type="dxa" w:w="10440"/>
-            <w:shd w:fill="FAF3E0" w:color="auto" w:val="clear"/>
+            <w:shd w:fill="E8F5E9" w:color="auto" w:val="clear"/>
             <w:tcMar>
               <w:top w:type="dxa" w:w="100"/>
               <w:left w:type="dxa" w:w="160"/>
@@ -1624,11 +1714,11 @@
                 <w:rFonts w:ascii="Arial" w:cs="Arial" w:eastAsia="Arial" w:hAnsi="Arial"/>
                 <w:b/>
                 <w:bCs/>
-                <w:color w:val="E65100"/>
+                <w:color w:val="43A047"/>
                 <w:sz w:val="17"/>
                 <w:szCs w:val="17"/>
               </w:rPr>
-              <w:t xml:space="preserve">Left Leg Asymmetry — 0.5 lb L/R Gap</w:t>
+              <w:t xml:space="preserve">ALST Optimal — 7.23 kg/m²</w:t>
             </w:r>
           </w:p>
           <w:p>
@@ -1639,7 +1729,7 @@
                 <w:sz w:val="17"/>
                 <w:szCs w:val="17"/>
               </w:rPr>
-              <w:t xml:space="preserve">Styku segmental LST: left leg 17.5 lbs vs right leg 18.0 lbs — gap sits exactly at the 0.5 lb asymmetry protocol trigger. Left leg has the lower LST value and leads all unilateral lower-body work; track gap at 8-week rescan.</w:t>
+              <w:t xml:space="preserve">Appendicular Lean Soft Tissue Index of 7.23 kg/m² is at/above the 7.0 EWGSOP2 optimal threshold — not At-Risk. This is not a sarcopenia profile; programming is strength-maintenance, not muscle-building-primary. Protein is still escalated to 2.0-2.2 g/kg/day (~156-172g/day), driven by the 50+ age rule independent of the ALST result.</w:t>
             </w:r>
           </w:p>
         </w:tc>
@@ -1701,69 +1791,7 @@
                 <w:sz w:val="17"/>
                 <w:szCs w:val="17"/>
               </w:rPr>
-              <w:t xml:space="preserve">Body fat 40.4% (Styku At-Risk, Mayo Clinic &gt;40% threshold; higher than 51% of women ages 50-59). BMI 29.5 — Overweight range. VFA 142.7 cm² — Moderate-High Risk. Shape Score 54/100 — Needs Improvement. BMR 1,451 cal/day. Android/gynoid mass ratio and subcutaneous fat reinforce the central-adiposity, cardiometabolic-first framing.</w:t>
-            </w:r>
-          </w:p>
-        </w:tc>
-      </w:tr>
-    </w:tbl>
-    <w:p>
-      <w:pPr>
-        <w:spacing w:after="120"/>
-      </w:pPr>
-    </w:p>
-    <w:tbl>
-      <w:tblPr>
-        <w:tblW w:type="dxa" w:w="10440"/>
-        <w:tblBorders>
-          <w:top w:val="single" w:color="43A047" w:sz="8"/>
-          <w:left w:val="single" w:color="43A047" w:sz="8"/>
-          <w:bottom w:val="single" w:color="43A047" w:sz="8"/>
-          <w:right w:val="single" w:color="43A047" w:sz="8"/>
-          <w:insideH w:val="single" w:color="43A047" w:sz="8"/>
-          <w:insideV w:val="single" w:color="43A047" w:sz="8"/>
-        </w:tblBorders>
-      </w:tblPr>
-      <w:tblGrid>
-        <w:gridCol w:w="100"/>
-      </w:tblGrid>
-      <w:tr>
-        <w:tc>
-          <w:tcPr>
-            <w:tcW w:type="dxa" w:w="10440"/>
-            <w:shd w:fill="E8F5E9" w:color="auto" w:val="clear"/>
-            <w:tcMar>
-              <w:top w:type="dxa" w:w="100"/>
-              <w:left w:type="dxa" w:w="160"/>
-              <w:bottom w:type="dxa" w:w="100"/>
-              <w:right w:type="dxa" w:w="160"/>
-            </w:tcMar>
-          </w:tcPr>
-          <w:p>
-            <w:pPr>
-              <w:spacing w:after="60"/>
-            </w:pPr>
-            <w:r>
-              <w:rPr>
-                <w:rFonts w:ascii="Arial" w:cs="Arial" w:eastAsia="Arial" w:hAnsi="Arial"/>
-                <w:b/>
-                <w:bCs/>
-                <w:color w:val="43A047"/>
-                <w:sz w:val="17"/>
-                <w:szCs w:val="17"/>
-              </w:rPr>
-              <w:t xml:space="preserve">Arm Asymmetry — Below Alert Threshold</w:t>
-            </w:r>
-          </w:p>
-          <w:p>
-            <w:r>
-              <w:rPr>
-                <w:rFonts w:ascii="Arial" w:cs="Arial" w:eastAsia="Arial" w:hAnsi="Arial"/>
-                <w:color w:val="2C2C2C"/>
-                <w:sz w:val="17"/>
-                <w:szCs w:val="17"/>
-              </w:rPr>
-              <w:t xml:space="preserve">Left arm 8.7 lbs vs right arm 8.4 lbs — 0.3 lb gap, below the 0.5 lb protocol trigger. No formal lead-side protocol required; log reps per side on single-arm work as routine tracking given the marginal right-side deficit.</w:t>
+              <w:t xml:space="preserve">Body fat 40.4% (Styku At-Risk rank, Mayo Clinic &gt;40% threshold; higher than 51% of women ages 50-59). BMI 29.5 — upper end of the overweight range (25-29.9), just under the ≥30 obesity threshold. VFA 142.7 cm² — cardiometabolic priority. Shape Score 54/100 — Needs Improvement. BMR 1,451 cal/day. Android/gynoid mass distribution and subcutaneous fat reinforce the central-adiposity, cardiometabolic-first framing over a muscle-building-primary approach.</w:t>
             </w:r>
           </w:p>
         </w:tc>
@@ -1814,7 +1842,7 @@
                 <w:sz w:val="17"/>
                 <w:szCs w:val="17"/>
               </w:rPr>
-              <w:t xml:space="preserve">Postmenopausal Status — Unconfirmed</w:t>
+              <w:t xml:space="preserve">Arm Asymmetry — Below Alert Threshold</w:t>
             </w:r>
           </w:p>
           <w:p>
@@ -1825,7 +1853,7 @@
                 <w:sz w:val="17"/>
                 <w:szCs w:val="17"/>
               </w:rPr>
-              <w:t xml:space="preserve">Client has not confirmed postmenopausal status. Age 51 falls within the typical menopausal transition window, so pelvic floor language is applied as a prudent default on heavy carry and hip thrust days — this is a precaution based on age, not an assertion of postmenopausal status.</w:t>
+              <w:t xml:space="preserve">Left arm 8.7 lbs vs right arm 8.4 lbs — 0.3 lb gap, below the 0.5 lb protocol trigger. No formal lead-side protocol required; right arm is marginally weaker and leads single-arm pressing/rowing as a precaution, with reps logged per side.</w:t>
             </w:r>
           </w:p>
         </w:tc>
@@ -1876,7 +1904,7 @@
                 <w:sz w:val="17"/>
                 <w:szCs w:val="17"/>
               </w:rPr>
-              <w:t xml:space="preserve">Untested Lifts</w:t>
+              <w:t xml:space="preserve">Postmenopausal Status — Unconfirmed</w:t>
             </w:r>
           </w:p>
           <w:p>
@@ -1887,7 +1915,69 @@
                 <w:sz w:val="17"/>
                 <w:szCs w:val="17"/>
               </w:rPr>
-              <w:t xml:space="preserve">Deadlift, Back Squat, and Lunges were not tested in the initial battery; Pull-Ups not attempted. Squat and deadlift hinge/knee patterns are introduced at technique-first loads on Day 2 and logged as the new baseline; Lunges to be formally baselined within 2 weeks; Pull-Ups reassessed Week 4.</w:t>
+              <w:t xml:space="preserve">Client has not confirmed postmenopausal status. Age 51 falls within the typical menopausal transition window, so pelvic floor bracing language is applied as a prudent default on heavy carry and hip thrust days — this is a precaution based on age, not an assertion of postmenopausal status.</w:t>
+            </w:r>
+          </w:p>
+        </w:tc>
+      </w:tr>
+    </w:tbl>
+    <w:p>
+      <w:pPr>
+        <w:spacing w:after="120"/>
+      </w:pPr>
+    </w:p>
+    <w:tbl>
+      <w:tblPr>
+        <w:tblW w:type="dxa" w:w="10440"/>
+        <w:tblBorders>
+          <w:top w:val="single" w:color="C9A227" w:sz="8"/>
+          <w:left w:val="single" w:color="C9A227" w:sz="8"/>
+          <w:bottom w:val="single" w:color="C9A227" w:sz="8"/>
+          <w:right w:val="single" w:color="C9A227" w:sz="8"/>
+          <w:insideH w:val="single" w:color="C9A227" w:sz="8"/>
+          <w:insideV w:val="single" w:color="C9A227" w:sz="8"/>
+        </w:tblBorders>
+      </w:tblPr>
+      <w:tblGrid>
+        <w:gridCol w:w="100"/>
+      </w:tblGrid>
+      <w:tr>
+        <w:tc>
+          <w:tcPr>
+            <w:tcW w:type="dxa" w:w="10440"/>
+            <w:shd w:fill="FAF3E0" w:color="auto" w:val="clear"/>
+            <w:tcMar>
+              <w:top w:type="dxa" w:w="100"/>
+              <w:left w:type="dxa" w:w="160"/>
+              <w:bottom w:type="dxa" w:w="100"/>
+              <w:right w:type="dxa" w:w="160"/>
+            </w:tcMar>
+          </w:tcPr>
+          <w:p>
+            <w:pPr>
+              <w:spacing w:after="60"/>
+            </w:pPr>
+            <w:r>
+              <w:rPr>
+                <w:rFonts w:ascii="Arial" w:cs="Arial" w:eastAsia="Arial" w:hAnsi="Arial"/>
+                <w:b/>
+                <w:bCs/>
+                <w:color w:val="C9A227"/>
+                <w:sz w:val="17"/>
+                <w:szCs w:val="17"/>
+              </w:rPr>
+              <w:t xml:space="preserve">Untested Lifts</w:t>
+            </w:r>
+          </w:p>
+          <w:p>
+            <w:r>
+              <w:rPr>
+                <w:rFonts w:ascii="Arial" w:cs="Arial" w:eastAsia="Arial" w:hAnsi="Arial"/>
+                <w:color w:val="2C2C2C"/>
+                <w:sz w:val="17"/>
+                <w:szCs w:val="17"/>
+              </w:rPr>
+              <w:t xml:space="preserve">Deadlift, Back Squat, Incline Dumbbell Press, Lunges, and Pull-Ups were not tested in the initial battery. Squat and deadlift hinge/knee patterns are introduced at technique-first loads on Day 2 and logged as the new baseline; Incline DB Press and Lunges to be formally baselined within 2 weeks; Pull-Ups reassessed Week 4.</w:t>
             </w:r>
           </w:p>
         </w:tc>
@@ -2650,7 +2740,7 @@
           <w:sz w:val="15"/>
           <w:szCs w:val="15"/>
         </w:rPr>
-        <w:t xml:space="preserve">70% day — moderate strength, building volume without peak CNS demand. Loads sit on established baselines (Hip Thrust, Seated OHP) while a conditioning finisher supports the VFA/body-fat priority. Strength maintenance, not muscle-building-primary — ALST is already optimal at 7.23 kg/m².</w:t>
+        <w:t xml:space="preserve">70% day — moderate strength, building volume without peak CNS demand. Loads sit on today's tested baselines (Hip Thrust, Seated OHP) while a conditioning finisher supports the VFA and body-fat priority from your Styku scan. This is strength maintenance layered under fat-loss focus, not muscle-building-primary — your ALST is already optimal at 7.23 kg/m².</w:t>
       </w:r>
     </w:p>
     <w:tbl>
@@ -3272,7 +3362,7 @@
                 <w:sz w:val="13"/>
                 <w:szCs w:val="13"/>
               </w:rPr>
-              <w:t xml:space="preserve">Brace low back flat, slow opposite arm/leg.</w:t>
+              <w:t xml:space="preserve">Brace low back flat, slow controlled reach.</w:t>
             </w:r>
           </w:p>
         </w:tc>
@@ -5738,7 +5828,7 @@
                 <w:sz w:val="17"/>
                 <w:szCs w:val="17"/>
               </w:rPr>
-              <w:t xml:space="preserve">Cardiometabolic priority this block — VFA 142.7 cm² and body fat 40.4% drive the conditioning finisher. Brace before every hip thrust and carry rep; flag any pelvic pressure, heaviness, or leaking to a coach immediately.</w:t>
+              <w:t xml:space="preserve">Cardiometabolic priority this block — VFA 142.7 cm² and body fat 40.4% drive the conditioning finisher. Brace before every hip thrust and carry rep and exhale on exertion; flag any pelvic pressure, heaviness, or leaking to a coach immediately.</w:t>
             </w:r>
           </w:p>
         </w:tc>
@@ -5870,7 +5960,7 @@
           <w:sz w:val="15"/>
           <w:szCs w:val="15"/>
         </w:rPr>
-        <w:t xml:space="preserve">60% day — technique priority. Squat and deadlift were not tested in the initial battery, so today's loads are deliberately light and become the new 8-week baseline. Left leg leads every unilateral set — Styku segmental LST shows a 0.5 lb deficit (17.5 vs 18.0 lbs), exactly at the asymmetry protocol trigger.</w:t>
+        <w:t xml:space="preserve">60% day — technique priority. Squat and deadlift were not tested in the initial battery, so today's loads are deliberately light and become the new 8-week baseline. Left leg leads every unilateral set — Styku segmental LST shows a 0.5 lb deficit (17.5 vs 18.0 lbs), exactly at the asymmetry protocol trigger. Work every set at 3+ RIR.</w:t>
       </w:r>
     </w:p>
     <w:tbl>
@@ -6281,7 +6371,7 @@
                 <w:sz w:val="13"/>
                 <w:szCs w:val="13"/>
               </w:rPr>
-              <w:t xml:space="preserve">controlled</w:t>
+              <w:t xml:space="preserve">continuous</w:t>
             </w:r>
           </w:p>
         </w:tc>
@@ -8584,7 +8674,7 @@
           <w:sz w:val="15"/>
           <w:szCs w:val="15"/>
         </w:rPr>
-        <w:t xml:space="preserve">70% day — moderate strength, building pressing/pulling volume without peak CNS demand. Suitcase carry and single-arm row are logged per side given the marginal right-arm deficit on Styku (below the formal 0.5 lb trigger, tracked as routine monitoring).</w:t>
+        <w:t xml:space="preserve">70% day — moderate strength, building pressing/pulling volume without peak CNS demand. Single-arm row and suitcase carry are logged per side given the marginal right-arm deficit on Styku (0.3 lb gap — below the formal 0.5 lb trigger, tracked as routine monitoring).</w:t>
       </w:r>
     </w:p>
     <w:tbl>
@@ -11145,7 +11235,7 @@
                 <w:sz w:val="13"/>
                 <w:szCs w:val="13"/>
               </w:rPr>
-              <w:t xml:space="preserve">Full stand each rep, breathe out on the way up.</w:t>
+              <w:t xml:space="preserve">Full stand each rep, exhale on the way up.</w:t>
             </w:r>
           </w:p>
         </w:tc>
@@ -11978,7 +12068,7 @@
                 <w:sz w:val="17"/>
                 <w:szCs w:val="17"/>
               </w:rPr>
-              <w:t xml:space="preserve">Full Styku rescan. VFA should trend down from 142.7 cm² toward the moderate-risk band; body fat % and Shape Score should improve; left-leg L/R gap should narrow below the 0.5 lb trigger; squat, deadlift, and lunge baselines formally established with 8-week targets set.</w:t>
+              <w:t xml:space="preserve">Full Styku rescan. VFA should trend down from 142.7 cm²; body fat % and Shape Score should improve; ALST should hold at or above 7.0 kg/m² (optimal); left-leg L/R gap should narrow below the 0.5 lb trigger; squat, deadlift, incline dumbbell press, and lunge baselines formally established with 8-week targets set.</w:t>
             </w:r>
           </w:p>
         </w:tc>
@@ -12040,7 +12130,7 @@
                 <w:sz w:val="17"/>
                 <w:szCs w:val="17"/>
               </w:rPr>
-              <w:t xml:space="preserve">Schedule Styku rescan at week 8 to confirm VFA and body fat trend, left-leg asymmetry reduction, and to formally baseline squat, deadlift, and lunges for future progression targets.</w:t>
+              <w:t xml:space="preserve">Schedule Styku rescan at week 8 to confirm VFA and body fat trend, left-leg asymmetry reduction, and to formally baseline squat, deadlift, incline dumbbell press, and lunges for future progression targets.</w:t>
             </w:r>
           </w:p>
         </w:tc>

</xml_diff>